<commit_message>
Přidat obrázky do DOCX exportu
Všech 16 obrázků z původního DOCX vloženo na správná místa i do reformatovaného DOCX.

https://claude.ai/code/session_01QwxPebMPNH171LeDT5mLuF
</commit_message>
<xml_diff>
--- a/Dvere_ve_zdi_reformatovano.docx
+++ b/Dvere_ve_zdi_reformatovano.docx
@@ -50,7 +50,7 @@
           <w:b/>
           <w:sz w:val="32"/>
         </w:rPr>
-        <w:t>Dveře ve zdi – 6</w:t>
+        <w:t>Dveře ve zdi – 6</w:t>
       </w:r>
     </w:p>
     <w:p>
@@ -491,8 +491,48 @@
     </w:p>
     <w:p>
       <w:pPr>
+        <w:spacing w:before="160" w:after="160"/>
+        <w:jc w:val="center"/>
+      </w:pPr>
+      <w:r>
+        <w:drawing>
+          <wp:inline xmlns:a="http://schemas.openxmlformats.org/drawingml/2006/main" xmlns:pic="http://schemas.openxmlformats.org/drawingml/2006/picture">
+            <wp:extent cx="5040000" cy="3628800"/>
+            <wp:docPr id="1" name="Picture 1"/>
+            <wp:cNvGraphicFramePr>
+              <a:graphicFrameLocks noChangeAspect="1"/>
+            </wp:cNvGraphicFramePr>
+            <a:graphic>
+              <a:graphicData uri="http://schemas.openxmlformats.org/drawingml/2006/picture">
+                <pic:pic>
+                  <pic:nvPicPr>
+                    <pic:cNvPr id="0" name="image.jpg"/>
+                    <pic:cNvPicPr/>
+                  </pic:nvPicPr>
+                  <pic:blipFill>
+                    <a:blip r:embed="rId9"/>
+                    <a:stretch>
+                      <a:fillRect/>
+                    </a:stretch>
+                  </pic:blipFill>
+                  <pic:spPr>
+                    <a:xfrm>
+                      <a:off x="0" y="0"/>
+                      <a:ext cx="5040000" cy="3628800"/>
+                    </a:xfrm>
+                    <a:prstGeom prst="rect"/>
+                  </pic:spPr>
+                </pic:pic>
+              </a:graphicData>
+            </a:graphic>
+          </wp:inline>
+        </w:drawing>
+      </w:r>
+    </w:p>
+    <w:p>
+      <w:pPr>
         <w:spacing w:before="0" w:after="120"/>
-        <w:ind w:firstLine="0"/>
+        <w:ind w:firstLine="709"/>
         <w:jc w:val="both"/>
       </w:pPr>
       <w:r>
@@ -711,6 +751,46 @@
           <w:sz w:val="24"/>
         </w:rPr>
         <w:t>Angličané si zřejmě pomysleli něco o tom, že “bodavým kravám Bůh rohy nedává”. A byla to svatá pravda. Amerika neměla rohy. Amerika neměla armádu.</w:t>
+      </w:r>
+    </w:p>
+    <w:p>
+      <w:pPr>
+        <w:spacing w:before="160" w:after="160"/>
+        <w:jc w:val="center"/>
+      </w:pPr>
+      <w:r>
+        <w:drawing>
+          <wp:inline xmlns:a="http://schemas.openxmlformats.org/drawingml/2006/main" xmlns:pic="http://schemas.openxmlformats.org/drawingml/2006/picture">
+            <wp:extent cx="5040000" cy="6710059"/>
+            <wp:docPr id="2" name="Picture 2"/>
+            <wp:cNvGraphicFramePr>
+              <a:graphicFrameLocks noChangeAspect="1"/>
+            </wp:cNvGraphicFramePr>
+            <a:graphic>
+              <a:graphicData uri="http://schemas.openxmlformats.org/drawingml/2006/picture">
+                <pic:pic>
+                  <pic:nvPicPr>
+                    <pic:cNvPr id="0" name="image.jpg"/>
+                    <pic:cNvPicPr/>
+                  </pic:nvPicPr>
+                  <pic:blipFill>
+                    <a:blip r:embed="rId10"/>
+                    <a:stretch>
+                      <a:fillRect/>
+                    </a:stretch>
+                  </pic:blipFill>
+                  <pic:spPr>
+                    <a:xfrm>
+                      <a:off x="0" y="0"/>
+                      <a:ext cx="5040000" cy="6710059"/>
+                    </a:xfrm>
+                    <a:prstGeom prst="rect"/>
+                  </pic:spPr>
+                </pic:pic>
+              </a:graphicData>
+            </a:graphic>
+          </wp:inline>
+        </w:drawing>
       </w:r>
     </w:p>
     <w:p>
@@ -758,7 +838,7 @@
           <w:b/>
           <w:sz w:val="32"/>
         </w:rPr>
-        <w:t>Dveře ve zdi – 25</w:t>
+        <w:t>Dveře ve zdi – 25</w:t>
       </w:r>
     </w:p>
     <w:p>
@@ -778,8 +858,48 @@
     </w:p>
     <w:p>
       <w:pPr>
+        <w:spacing w:before="160" w:after="160"/>
+        <w:jc w:val="center"/>
+      </w:pPr>
+      <w:r>
+        <w:drawing>
+          <wp:inline xmlns:a="http://schemas.openxmlformats.org/drawingml/2006/main" xmlns:pic="http://schemas.openxmlformats.org/drawingml/2006/picture">
+            <wp:extent cx="5040000" cy="3360000"/>
+            <wp:docPr id="3" name="Picture 3"/>
+            <wp:cNvGraphicFramePr>
+              <a:graphicFrameLocks noChangeAspect="1"/>
+            </wp:cNvGraphicFramePr>
+            <a:graphic>
+              <a:graphicData uri="http://schemas.openxmlformats.org/drawingml/2006/picture">
+                <pic:pic>
+                  <pic:nvPicPr>
+                    <pic:cNvPr id="0" name="image.jpg"/>
+                    <pic:cNvPicPr/>
+                  </pic:nvPicPr>
+                  <pic:blipFill>
+                    <a:blip r:embed="rId11"/>
+                    <a:stretch>
+                      <a:fillRect/>
+                    </a:stretch>
+                  </pic:blipFill>
+                  <pic:spPr>
+                    <a:xfrm>
+                      <a:off x="0" y="0"/>
+                      <a:ext cx="5040000" cy="3360000"/>
+                    </a:xfrm>
+                    <a:prstGeom prst="rect"/>
+                  </pic:spPr>
+                </pic:pic>
+              </a:graphicData>
+            </a:graphic>
+          </wp:inline>
+        </w:drawing>
+      </w:r>
+    </w:p>
+    <w:p>
+      <w:pPr>
         <w:spacing w:before="0" w:after="120"/>
-        <w:ind w:firstLine="0"/>
+        <w:ind w:firstLine="709"/>
         <w:jc w:val="both"/>
       </w:pPr>
       <w:r>
@@ -975,7 +1095,7 @@
           <w:b/>
           <w:sz w:val="32"/>
         </w:rPr>
-        <w:t>Dveře ve zdi – 26</w:t>
+        <w:t>Dveře ve zdi – 26</w:t>
       </w:r>
     </w:p>
     <w:p>
@@ -1121,6 +1241,46 @@
     </w:p>
     <w:p>
       <w:pPr>
+        <w:spacing w:before="160" w:after="160"/>
+        <w:jc w:val="center"/>
+      </w:pPr>
+      <w:r>
+        <w:drawing>
+          <wp:inline xmlns:a="http://schemas.openxmlformats.org/drawingml/2006/main" xmlns:pic="http://schemas.openxmlformats.org/drawingml/2006/picture">
+            <wp:extent cx="5040000" cy="3055500"/>
+            <wp:docPr id="4" name="Picture 4"/>
+            <wp:cNvGraphicFramePr>
+              <a:graphicFrameLocks noChangeAspect="1"/>
+            </wp:cNvGraphicFramePr>
+            <a:graphic>
+              <a:graphicData uri="http://schemas.openxmlformats.org/drawingml/2006/picture">
+                <pic:pic>
+                  <pic:nvPicPr>
+                    <pic:cNvPr id="0" name="image.jpg"/>
+                    <pic:cNvPicPr/>
+                  </pic:nvPicPr>
+                  <pic:blipFill>
+                    <a:blip r:embed="rId12"/>
+                    <a:stretch>
+                      <a:fillRect/>
+                    </a:stretch>
+                  </pic:blipFill>
+                  <pic:spPr>
+                    <a:xfrm>
+                      <a:off x="0" y="0"/>
+                      <a:ext cx="5040000" cy="3055500"/>
+                    </a:xfrm>
+                    <a:prstGeom prst="rect"/>
+                  </pic:spPr>
+                </pic:pic>
+              </a:graphicData>
+            </a:graphic>
+          </wp:inline>
+        </w:drawing>
+      </w:r>
+    </w:p>
+    <w:p>
+      <w:pPr>
         <w:spacing w:before="0" w:after="120"/>
         <w:ind w:firstLine="709"/>
         <w:jc w:val="both"/>
@@ -1207,7 +1367,7 @@
           <w:b/>
           <w:sz w:val="32"/>
         </w:rPr>
-        <w:t>Dveře ve zdi – 27</w:t>
+        <w:t>Dveře ve zdi – 27</w:t>
       </w:r>
     </w:p>
     <w:p>
@@ -1397,18 +1557,20 @@
           <w:b/>
           <w:sz w:val="32"/>
         </w:rPr>
-        <w:t>Dveře ve zdi – 28</w:t>
-      </w:r>
-    </w:p>
-    <w:p>
-      <w:pPr>
-        <w:spacing w:before="200" w:after="80"/>
+        <w:t>Dveře ve zdi – 28</w:t>
+      </w:r>
+    </w:p>
+    <w:p>
+      <w:pPr>
+        <w:spacing w:before="0" w:after="160"/>
         <w:jc w:val="left"/>
       </w:pPr>
       <w:r>
         <w:rPr>
           <w:rFonts w:ascii="Times New Roman" w:hAnsi="Times New Roman"/>
           <w:b/>
+          <w:i/>
+          <w:color w:val="444444"/>
           <w:sz w:val="24"/>
         </w:rPr>
         <w:t>Poprava carské rodiny. Náčelník Mkwawa.</w:t>
@@ -1431,8 +1593,48 @@
     </w:p>
     <w:p>
       <w:pPr>
+        <w:spacing w:before="160" w:after="160"/>
+        <w:jc w:val="center"/>
+      </w:pPr>
+      <w:r>
+        <w:drawing>
+          <wp:inline xmlns:a="http://schemas.openxmlformats.org/drawingml/2006/main" xmlns:pic="http://schemas.openxmlformats.org/drawingml/2006/picture">
+            <wp:extent cx="5040000" cy="4688727"/>
+            <wp:docPr id="5" name="Picture 5"/>
+            <wp:cNvGraphicFramePr>
+              <a:graphicFrameLocks noChangeAspect="1"/>
+            </wp:cNvGraphicFramePr>
+            <a:graphic>
+              <a:graphicData uri="http://schemas.openxmlformats.org/drawingml/2006/picture">
+                <pic:pic>
+                  <pic:nvPicPr>
+                    <pic:cNvPr id="0" name="image.jpg"/>
+                    <pic:cNvPicPr/>
+                  </pic:nvPicPr>
+                  <pic:blipFill>
+                    <a:blip r:embed="rId13"/>
+                    <a:stretch>
+                      <a:fillRect/>
+                    </a:stretch>
+                  </pic:blipFill>
+                  <pic:spPr>
+                    <a:xfrm>
+                      <a:off x="0" y="0"/>
+                      <a:ext cx="5040000" cy="4688727"/>
+                    </a:xfrm>
+                    <a:prstGeom prst="rect"/>
+                  </pic:spPr>
+                </pic:pic>
+              </a:graphicData>
+            </a:graphic>
+          </wp:inline>
+        </w:drawing>
+      </w:r>
+    </w:p>
+    <w:p>
+      <w:pPr>
         <w:spacing w:before="0" w:after="120"/>
-        <w:ind w:firstLine="0"/>
+        <w:ind w:firstLine="709"/>
         <w:jc w:val="both"/>
       </w:pPr>
       <w:r>
@@ -1459,13 +1661,13 @@
     </w:p>
     <w:p>
       <w:pPr>
-        <w:spacing w:before="200" w:after="80"/>
-        <w:jc w:val="left"/>
+        <w:spacing w:before="0" w:after="120"/>
+        <w:ind w:firstLine="709"/>
+        <w:jc w:val="both"/>
       </w:pPr>
       <w:r>
         <w:rPr>
           <w:rFonts w:ascii="Times New Roman" w:hAnsi="Times New Roman"/>
-          <w:b/>
           <w:sz w:val="24"/>
         </w:rPr>
         <w:t>Cui prodest?</w:t>
@@ -1557,13 +1759,13 @@
     </w:p>
     <w:p>
       <w:pPr>
-        <w:spacing w:before="200" w:after="80"/>
-        <w:jc w:val="left"/>
+        <w:spacing w:before="0" w:after="120"/>
+        <w:ind w:firstLine="709"/>
+        <w:jc w:val="both"/>
       </w:pPr>
       <w:r>
         <w:rPr>
           <w:rFonts w:ascii="Times New Roman" w:hAnsi="Times New Roman"/>
-          <w:b/>
           <w:sz w:val="24"/>
         </w:rPr>
         <w:t>Bolševici?</w:t>
@@ -1613,13 +1815,13 @@
     </w:p>
     <w:p>
       <w:pPr>
-        <w:spacing w:before="200" w:after="80"/>
-        <w:jc w:val="left"/>
+        <w:spacing w:before="0" w:after="120"/>
+        <w:ind w:firstLine="709"/>
+        <w:jc w:val="both"/>
       </w:pPr>
       <w:r>
         <w:rPr>
           <w:rFonts w:ascii="Times New Roman" w:hAnsi="Times New Roman"/>
-          <w:b/>
           <w:sz w:val="24"/>
         </w:rPr>
         <w:t>Angličané? Američané? Francouzi?</w:t>
@@ -1627,13 +1829,13 @@
     </w:p>
     <w:p>
       <w:pPr>
-        <w:spacing w:before="200" w:after="80"/>
-        <w:jc w:val="left"/>
+        <w:spacing w:before="0" w:after="120"/>
+        <w:ind w:firstLine="709"/>
+        <w:jc w:val="both"/>
       </w:pPr>
       <w:r>
         <w:rPr>
           <w:rFonts w:ascii="Times New Roman" w:hAnsi="Times New Roman"/>
-          <w:b/>
           <w:sz w:val="24"/>
         </w:rPr>
         <w:t>“Dohoda”?</w:t>
@@ -1739,6 +1941,46 @@
     </w:p>
     <w:p>
       <w:pPr>
+        <w:spacing w:before="160" w:after="160"/>
+        <w:jc w:val="center"/>
+      </w:pPr>
+      <w:r>
+        <w:drawing>
+          <wp:inline xmlns:a="http://schemas.openxmlformats.org/drawingml/2006/main" xmlns:pic="http://schemas.openxmlformats.org/drawingml/2006/picture">
+            <wp:extent cx="5040000" cy="3780000"/>
+            <wp:docPr id="6" name="Picture 6"/>
+            <wp:cNvGraphicFramePr>
+              <a:graphicFrameLocks noChangeAspect="1"/>
+            </wp:cNvGraphicFramePr>
+            <a:graphic>
+              <a:graphicData uri="http://schemas.openxmlformats.org/drawingml/2006/picture">
+                <pic:pic>
+                  <pic:nvPicPr>
+                    <pic:cNvPr id="0" name="image.jpg"/>
+                    <pic:cNvPicPr/>
+                  </pic:nvPicPr>
+                  <pic:blipFill>
+                    <a:blip r:embed="rId14"/>
+                    <a:stretch>
+                      <a:fillRect/>
+                    </a:stretch>
+                  </pic:blipFill>
+                  <pic:spPr>
+                    <a:xfrm>
+                      <a:off x="0" y="0"/>
+                      <a:ext cx="5040000" cy="3780000"/>
+                    </a:xfrm>
+                    <a:prstGeom prst="rect"/>
+                  </pic:spPr>
+                </pic:pic>
+              </a:graphicData>
+            </a:graphic>
+          </wp:inline>
+        </w:drawing>
+      </w:r>
+    </w:p>
+    <w:p>
+      <w:pPr>
         <w:spacing w:before="0" w:after="120"/>
         <w:ind w:firstLine="709"/>
         <w:jc w:val="both"/>
@@ -1825,7 +2067,7 @@
           <w:b/>
           <w:sz w:val="32"/>
         </w:rPr>
-        <w:t>Dveře ve zdi – 29</w:t>
+        <w:t>Dveře ve zdi – 29</w:t>
       </w:r>
     </w:p>
     <w:p>
@@ -1957,6 +2199,46 @@
     </w:p>
     <w:p>
       <w:pPr>
+        <w:spacing w:before="160" w:after="160"/>
+        <w:jc w:val="center"/>
+      </w:pPr>
+      <w:r>
+        <w:drawing>
+          <wp:inline xmlns:a="http://schemas.openxmlformats.org/drawingml/2006/main" xmlns:pic="http://schemas.openxmlformats.org/drawingml/2006/picture">
+            <wp:extent cx="5040000" cy="6136098"/>
+            <wp:docPr id="7" name="Picture 7"/>
+            <wp:cNvGraphicFramePr>
+              <a:graphicFrameLocks noChangeAspect="1"/>
+            </wp:cNvGraphicFramePr>
+            <a:graphic>
+              <a:graphicData uri="http://schemas.openxmlformats.org/drawingml/2006/picture">
+                <pic:pic>
+                  <pic:nvPicPr>
+                    <pic:cNvPr id="0" name="image.jpg"/>
+                    <pic:cNvPicPr/>
+                  </pic:nvPicPr>
+                  <pic:blipFill>
+                    <a:blip r:embed="rId15"/>
+                    <a:stretch>
+                      <a:fillRect/>
+                    </a:stretch>
+                  </pic:blipFill>
+                  <pic:spPr>
+                    <a:xfrm>
+                      <a:off x="0" y="0"/>
+                      <a:ext cx="5040000" cy="6136098"/>
+                    </a:xfrm>
+                    <a:prstGeom prst="rect"/>
+                  </pic:spPr>
+                </pic:pic>
+              </a:graphicData>
+            </a:graphic>
+          </wp:inline>
+        </w:drawing>
+      </w:r>
+    </w:p>
+    <w:p>
+      <w:pPr>
         <w:spacing w:before="0" w:after="120"/>
         <w:ind w:firstLine="709"/>
         <w:jc w:val="both"/>
@@ -2043,18 +2325,20 @@
           <w:b/>
           <w:sz w:val="32"/>
         </w:rPr>
-        <w:t>Dveře ve zdi – 30</w:t>
-      </w:r>
-    </w:p>
-    <w:p>
-      <w:pPr>
-        <w:spacing w:before="0" w:after="120"/>
-        <w:ind w:firstLine="0"/>
-        <w:jc w:val="both"/>
+        <w:t>Dveře ve zdi – 30</w:t>
+      </w:r>
+    </w:p>
+    <w:p>
+      <w:pPr>
+        <w:spacing w:before="0" w:after="160"/>
+        <w:jc w:val="left"/>
       </w:pPr>
       <w:r>
         <w:rPr>
           <w:rFonts w:ascii="Times New Roman" w:hAnsi="Times New Roman"/>
+          <w:b/>
+          <w:i/>
+          <w:color w:val="444444"/>
           <w:sz w:val="24"/>
         </w:rPr>
         <w:t>Virtuózní finta “šestého bodu” prezidenta Wilsona. Přeložil Hamilbar, převzato odtud.</w:t>
@@ -2063,7 +2347,7 @@
     <w:p>
       <w:pPr>
         <w:spacing w:before="0" w:after="120"/>
-        <w:ind w:firstLine="709"/>
+        <w:ind w:firstLine="0"/>
         <w:jc w:val="both"/>
       </w:pPr>
       <w:r>
@@ -2258,6 +2542,46 @@
     </w:p>
     <w:p>
       <w:pPr>
+        <w:spacing w:before="160" w:after="160"/>
+        <w:jc w:val="center"/>
+      </w:pPr>
+      <w:r>
+        <w:drawing>
+          <wp:inline xmlns:a="http://schemas.openxmlformats.org/drawingml/2006/main" xmlns:pic="http://schemas.openxmlformats.org/drawingml/2006/picture">
+            <wp:extent cx="5040000" cy="8093727"/>
+            <wp:docPr id="8" name="Picture 8"/>
+            <wp:cNvGraphicFramePr>
+              <a:graphicFrameLocks noChangeAspect="1"/>
+            </wp:cNvGraphicFramePr>
+            <a:graphic>
+              <a:graphicData uri="http://schemas.openxmlformats.org/drawingml/2006/picture">
+                <pic:pic>
+                  <pic:nvPicPr>
+                    <pic:cNvPr id="0" name="image.jpg"/>
+                    <pic:cNvPicPr/>
+                  </pic:nvPicPr>
+                  <pic:blipFill>
+                    <a:blip r:embed="rId16"/>
+                    <a:stretch>
+                      <a:fillRect/>
+                    </a:stretch>
+                  </pic:blipFill>
+                  <pic:spPr>
+                    <a:xfrm>
+                      <a:off x="0" y="0"/>
+                      <a:ext cx="5040000" cy="8093727"/>
+                    </a:xfrm>
+                    <a:prstGeom prst="rect"/>
+                  </pic:spPr>
+                </pic:pic>
+              </a:graphicData>
+            </a:graphic>
+          </wp:inline>
+        </w:drawing>
+      </w:r>
+    </w:p>
+    <w:p>
+      <w:pPr>
         <w:spacing w:before="0" w:after="0"/>
       </w:pPr>
       <w:r>
@@ -2274,7 +2598,7 @@
           <w:b/>
           <w:sz w:val="32"/>
         </w:rPr>
-        <w:t>Dveře ve zdi – 31</w:t>
+        <w:t>Dveře ve zdi – 31</w:t>
       </w:r>
     </w:p>
     <w:p>
@@ -2294,8 +2618,48 @@
     </w:p>
     <w:p>
       <w:pPr>
+        <w:spacing w:before="160" w:after="160"/>
+        <w:jc w:val="center"/>
+      </w:pPr>
+      <w:r>
+        <w:drawing>
+          <wp:inline xmlns:a="http://schemas.openxmlformats.org/drawingml/2006/main" xmlns:pic="http://schemas.openxmlformats.org/drawingml/2006/picture">
+            <wp:extent cx="5040000" cy="3590031"/>
+            <wp:docPr id="9" name="Picture 9"/>
+            <wp:cNvGraphicFramePr>
+              <a:graphicFrameLocks noChangeAspect="1"/>
+            </wp:cNvGraphicFramePr>
+            <a:graphic>
+              <a:graphicData uri="http://schemas.openxmlformats.org/drawingml/2006/picture">
+                <pic:pic>
+                  <pic:nvPicPr>
+                    <pic:cNvPr id="0" name="image.jpg"/>
+                    <pic:cNvPicPr/>
+                  </pic:nvPicPr>
+                  <pic:blipFill>
+                    <a:blip r:embed="rId17"/>
+                    <a:stretch>
+                      <a:fillRect/>
+                    </a:stretch>
+                  </pic:blipFill>
+                  <pic:spPr>
+                    <a:xfrm>
+                      <a:off x="0" y="0"/>
+                      <a:ext cx="5040000" cy="3590031"/>
+                    </a:xfrm>
+                    <a:prstGeom prst="rect"/>
+                  </pic:spPr>
+                </pic:pic>
+              </a:graphicData>
+            </a:graphic>
+          </wp:inline>
+        </w:drawing>
+      </w:r>
+    </w:p>
+    <w:p>
+      <w:pPr>
         <w:spacing w:before="0" w:after="120"/>
-        <w:ind w:firstLine="0"/>
+        <w:ind w:firstLine="709"/>
         <w:jc w:val="both"/>
       </w:pPr>
       <w:r>
@@ -2534,7 +2898,7 @@
           <w:b/>
           <w:sz w:val="32"/>
         </w:rPr>
-        <w:t>Dveře ve zdi – 32</w:t>
+        <w:t>Dveře ve zdi – 32</w:t>
       </w:r>
     </w:p>
     <w:p>
@@ -2554,8 +2918,48 @@
     </w:p>
     <w:p>
       <w:pPr>
+        <w:spacing w:before="160" w:after="160"/>
+        <w:jc w:val="center"/>
+      </w:pPr>
+      <w:r>
+        <w:drawing>
+          <wp:inline xmlns:a="http://schemas.openxmlformats.org/drawingml/2006/main" xmlns:pic="http://schemas.openxmlformats.org/drawingml/2006/picture">
+            <wp:extent cx="5040000" cy="6123651"/>
+            <wp:docPr id="10" name="Picture 10"/>
+            <wp:cNvGraphicFramePr>
+              <a:graphicFrameLocks noChangeAspect="1"/>
+            </wp:cNvGraphicFramePr>
+            <a:graphic>
+              <a:graphicData uri="http://schemas.openxmlformats.org/drawingml/2006/picture">
+                <pic:pic>
+                  <pic:nvPicPr>
+                    <pic:cNvPr id="0" name="image.jpg"/>
+                    <pic:cNvPicPr/>
+                  </pic:nvPicPr>
+                  <pic:blipFill>
+                    <a:blip r:embed="rId18"/>
+                    <a:stretch>
+                      <a:fillRect/>
+                    </a:stretch>
+                  </pic:blipFill>
+                  <pic:spPr>
+                    <a:xfrm>
+                      <a:off x="0" y="0"/>
+                      <a:ext cx="5040000" cy="6123651"/>
+                    </a:xfrm>
+                    <a:prstGeom prst="rect"/>
+                  </pic:spPr>
+                </pic:pic>
+              </a:graphicData>
+            </a:graphic>
+          </wp:inline>
+        </w:drawing>
+      </w:r>
+    </w:p>
+    <w:p>
+      <w:pPr>
         <w:spacing w:before="0" w:after="120"/>
-        <w:ind w:firstLine="0"/>
+        <w:ind w:firstLine="709"/>
         <w:jc w:val="both"/>
       </w:pPr>
       <w:r>
@@ -2934,7 +3338,7 @@
           <w:b/>
           <w:sz w:val="32"/>
         </w:rPr>
-        <w:t>Dveře ve zdi – 35</w:t>
+        <w:t>Dveře ve zdi – 35</w:t>
       </w:r>
     </w:p>
     <w:p>
@@ -2954,13 +3358,13 @@
     </w:p>
     <w:p>
       <w:pPr>
-        <w:spacing w:before="200" w:after="80"/>
-        <w:jc w:val="left"/>
+        <w:spacing w:before="0" w:after="120"/>
+        <w:ind w:firstLine="0"/>
+        <w:jc w:val="both"/>
       </w:pPr>
       <w:r>
         <w:rPr>
           <w:rFonts w:ascii="Times New Roman" w:hAnsi="Times New Roman"/>
-          <w:b/>
           <w:sz w:val="24"/>
         </w:rPr>
         <w:t>Je možné stvořit si nepřítele?</w:t>
@@ -3094,6 +3498,46 @@
     </w:p>
     <w:p>
       <w:pPr>
+        <w:spacing w:before="160" w:after="160"/>
+        <w:jc w:val="center"/>
+      </w:pPr>
+      <w:r>
+        <w:drawing>
+          <wp:inline xmlns:a="http://schemas.openxmlformats.org/drawingml/2006/main" xmlns:pic="http://schemas.openxmlformats.org/drawingml/2006/picture">
+            <wp:extent cx="5040000" cy="7698329"/>
+            <wp:docPr id="11" name="Picture 11"/>
+            <wp:cNvGraphicFramePr>
+              <a:graphicFrameLocks noChangeAspect="1"/>
+            </wp:cNvGraphicFramePr>
+            <a:graphic>
+              <a:graphicData uri="http://schemas.openxmlformats.org/drawingml/2006/picture">
+                <pic:pic>
+                  <pic:nvPicPr>
+                    <pic:cNvPr id="0" name="image.jpg"/>
+                    <pic:cNvPicPr/>
+                  </pic:nvPicPr>
+                  <pic:blipFill>
+                    <a:blip r:embed="rId19"/>
+                    <a:stretch>
+                      <a:fillRect/>
+                    </a:stretch>
+                  </pic:blipFill>
+                  <pic:spPr>
+                    <a:xfrm>
+                      <a:off x="0" y="0"/>
+                      <a:ext cx="5040000" cy="7698329"/>
+                    </a:xfrm>
+                    <a:prstGeom prst="rect"/>
+                  </pic:spPr>
+                </pic:pic>
+              </a:graphicData>
+            </a:graphic>
+          </wp:inline>
+        </w:drawing>
+      </w:r>
+    </w:p>
+    <w:p>
+      <w:pPr>
         <w:spacing w:before="0" w:after="120"/>
         <w:ind w:firstLine="709"/>
         <w:jc w:val="both"/>
@@ -3202,6 +3646,46 @@
           <w:sz w:val="24"/>
         </w:rPr>
         <w:t>Nemusíme ani zacházet příliš daleko do minulosti, začneme počátkem XX. století, z toho okamžiku, kdy budoucí Nositel Světla vyměnil spolu s mléčnými zuby i mléčné jméno. Ho Či Min (budeme se snažit, pokud síly dovolí, používat jeho poslední jméno) se narodil a své bosonohé dětství prožil ne ve Vietnamu, který tehdy ještě neexistoval, ale ve Francouzské Indočíně. Mapa jihovýchodní Asie vypadala tehdy pro nás trochu nezvykle takto:</w:t>
+      </w:r>
+    </w:p>
+    <w:p>
+      <w:pPr>
+        <w:spacing w:before="160" w:after="160"/>
+        <w:jc w:val="center"/>
+      </w:pPr>
+      <w:r>
+        <w:drawing>
+          <wp:inline xmlns:a="http://schemas.openxmlformats.org/drawingml/2006/main" xmlns:pic="http://schemas.openxmlformats.org/drawingml/2006/picture">
+            <wp:extent cx="5040000" cy="3528000"/>
+            <wp:docPr id="12" name="Picture 12"/>
+            <wp:cNvGraphicFramePr>
+              <a:graphicFrameLocks noChangeAspect="1"/>
+            </wp:cNvGraphicFramePr>
+            <a:graphic>
+              <a:graphicData uri="http://schemas.openxmlformats.org/drawingml/2006/picture">
+                <pic:pic>
+                  <pic:nvPicPr>
+                    <pic:cNvPr id="0" name="image.jpg"/>
+                    <pic:cNvPicPr/>
+                  </pic:nvPicPr>
+                  <pic:blipFill>
+                    <a:blip r:embed="rId20"/>
+                    <a:stretch>
+                      <a:fillRect/>
+                    </a:stretch>
+                  </pic:blipFill>
+                  <pic:spPr>
+                    <a:xfrm>
+                      <a:off x="0" y="0"/>
+                      <a:ext cx="5040000" cy="3528000"/>
+                    </a:xfrm>
+                    <a:prstGeom prst="rect"/>
+                  </pic:spPr>
+                </pic:pic>
+              </a:graphicData>
+            </a:graphic>
+          </wp:inline>
+        </w:drawing>
       </w:r>
     </w:p>
     <w:p>
@@ -3264,6 +3748,46 @@
     </w:p>
     <w:p>
       <w:pPr>
+        <w:spacing w:before="160" w:after="160"/>
+        <w:jc w:val="center"/>
+      </w:pPr>
+      <w:r>
+        <w:drawing>
+          <wp:inline xmlns:a="http://schemas.openxmlformats.org/drawingml/2006/main" xmlns:pic="http://schemas.openxmlformats.org/drawingml/2006/picture">
+            <wp:extent cx="5040000" cy="2772000"/>
+            <wp:docPr id="13" name="Picture 13"/>
+            <wp:cNvGraphicFramePr>
+              <a:graphicFrameLocks noChangeAspect="1"/>
+            </wp:cNvGraphicFramePr>
+            <a:graphic>
+              <a:graphicData uri="http://schemas.openxmlformats.org/drawingml/2006/picture">
+                <pic:pic>
+                  <pic:nvPicPr>
+                    <pic:cNvPr id="0" name="image.jpg"/>
+                    <pic:cNvPicPr/>
+                  </pic:nvPicPr>
+                  <pic:blipFill>
+                    <a:blip r:embed="rId21"/>
+                    <a:stretch>
+                      <a:fillRect/>
+                    </a:stretch>
+                  </pic:blipFill>
+                  <pic:spPr>
+                    <a:xfrm>
+                      <a:off x="0" y="0"/>
+                      <a:ext cx="5040000" cy="2772000"/>
+                    </a:xfrm>
+                    <a:prstGeom prst="rect"/>
+                  </pic:spPr>
+                </pic:pic>
+              </a:graphicData>
+            </a:graphic>
+          </wp:inline>
+        </w:drawing>
+      </w:r>
+    </w:p>
+    <w:p>
+      <w:pPr>
         <w:spacing w:before="0" w:after="120"/>
         <w:ind w:firstLine="709"/>
         <w:jc w:val="both"/>
@@ -3278,6 +3802,46 @@
     </w:p>
     <w:p>
       <w:pPr>
+        <w:spacing w:before="160" w:after="160"/>
+        <w:jc w:val="center"/>
+      </w:pPr>
+      <w:r>
+        <w:drawing>
+          <wp:inline xmlns:a="http://schemas.openxmlformats.org/drawingml/2006/main" xmlns:pic="http://schemas.openxmlformats.org/drawingml/2006/picture">
+            <wp:extent cx="5040000" cy="2520000"/>
+            <wp:docPr id="14" name="Picture 14"/>
+            <wp:cNvGraphicFramePr>
+              <a:graphicFrameLocks noChangeAspect="1"/>
+            </wp:cNvGraphicFramePr>
+            <a:graphic>
+              <a:graphicData uri="http://schemas.openxmlformats.org/drawingml/2006/picture">
+                <pic:pic>
+                  <pic:nvPicPr>
+                    <pic:cNvPr id="0" name="image.jpg"/>
+                    <pic:cNvPicPr/>
+                  </pic:nvPicPr>
+                  <pic:blipFill>
+                    <a:blip r:embed="rId22"/>
+                    <a:stretch>
+                      <a:fillRect/>
+                    </a:stretch>
+                  </pic:blipFill>
+                  <pic:spPr>
+                    <a:xfrm>
+                      <a:off x="0" y="0"/>
+                      <a:ext cx="5040000" cy="2520000"/>
+                    </a:xfrm>
+                    <a:prstGeom prst="rect"/>
+                  </pic:spPr>
+                </pic:pic>
+              </a:graphicData>
+            </a:graphic>
+          </wp:inline>
+        </w:drawing>
+      </w:r>
+    </w:p>
+    <w:p>
+      <w:pPr>
         <w:spacing w:before="0" w:after="120"/>
         <w:ind w:firstLine="709"/>
         <w:jc w:val="both"/>
@@ -3308,7 +3872,7 @@
           <w:b/>
           <w:sz w:val="32"/>
         </w:rPr>
-        <w:t>Dveře ve zdi – 36</w:t>
+        <w:t>Dveře ve zdi – 36</w:t>
       </w:r>
     </w:p>
     <w:p>
@@ -3328,8 +3892,48 @@
     </w:p>
     <w:p>
       <w:pPr>
+        <w:spacing w:before="160" w:after="160"/>
+        <w:jc w:val="center"/>
+      </w:pPr>
+      <w:r>
+        <w:drawing>
+          <wp:inline xmlns:a="http://schemas.openxmlformats.org/drawingml/2006/main" xmlns:pic="http://schemas.openxmlformats.org/drawingml/2006/picture">
+            <wp:extent cx="5040000" cy="3732750"/>
+            <wp:docPr id="15" name="Picture 15"/>
+            <wp:cNvGraphicFramePr>
+              <a:graphicFrameLocks noChangeAspect="1"/>
+            </wp:cNvGraphicFramePr>
+            <a:graphic>
+              <a:graphicData uri="http://schemas.openxmlformats.org/drawingml/2006/picture">
+                <pic:pic>
+                  <pic:nvPicPr>
+                    <pic:cNvPr id="0" name="image.jpg"/>
+                    <pic:cNvPicPr/>
+                  </pic:nvPicPr>
+                  <pic:blipFill>
+                    <a:blip r:embed="rId23"/>
+                    <a:stretch>
+                      <a:fillRect/>
+                    </a:stretch>
+                  </pic:blipFill>
+                  <pic:spPr>
+                    <a:xfrm>
+                      <a:off x="0" y="0"/>
+                      <a:ext cx="5040000" cy="3732750"/>
+                    </a:xfrm>
+                    <a:prstGeom prst="rect"/>
+                  </pic:spPr>
+                </pic:pic>
+              </a:graphicData>
+            </a:graphic>
+          </wp:inline>
+        </w:drawing>
+      </w:r>
+    </w:p>
+    <w:p>
+      <w:pPr>
         <w:spacing w:before="0" w:after="120"/>
-        <w:ind w:firstLine="0"/>
+        <w:ind w:firstLine="709"/>
         <w:jc w:val="both"/>
       </w:pPr>
       <w:r>
@@ -3498,7 +4102,7 @@
           <w:b/>
           <w:sz w:val="32"/>
         </w:rPr>
-        <w:t>Dveře ve zdi – 37</w:t>
+        <w:t>Dveře ve zdi – 37</w:t>
       </w:r>
     </w:p>
     <w:p>
@@ -3810,6 +4414,46 @@
           <w:sz w:val="24"/>
         </w:rPr>
         <w:t>To, co provozoval v ulicích New Yorku Marcus Garvey, nebylo na první pohled vůbec v zájmu USA, k čemu potřebovali “černý nacionalismus”? Ovšem uplynul jeden den, uplynul druhý, uplynul měsíc, Garvey řečnil a řečnil, vydával, redigoval, a potom se z ničeho nic ukázalo, že není jenom “nacionalistou” ale také “panafrikanistou”. Ten kdo se domnívá, že sjednocovat lze jenom Turky nebo Slovany se mýlí. V předponě “pan” není nic mimořádného, a jestliže existuje “panturkismus” a “panslavismus”, proč by nemohl existovat “panafrikanismus”? Tak tedy vznikl. Ale jestliže se “černý nacionalismus” nehodil Američanům, ale zato se docela hodil hrdým Britům, pak s “panafrikou” požadující okamžitě osvobodit a sjednotit obyvatele Černého kontinentu to bylo úplně obráceně. Afrika s předponou “pan” se moc hodila Američanům, zato se vůbec nehodila Angličanům.</w:t>
+      </w:r>
+    </w:p>
+    <w:p>
+      <w:pPr>
+        <w:spacing w:before="160" w:after="160"/>
+        <w:jc w:val="center"/>
+      </w:pPr>
+      <w:r>
+        <w:drawing>
+          <wp:inline xmlns:a="http://schemas.openxmlformats.org/drawingml/2006/main" xmlns:pic="http://schemas.openxmlformats.org/drawingml/2006/picture">
+            <wp:extent cx="5040000" cy="7478710"/>
+            <wp:docPr id="16" name="Picture 16"/>
+            <wp:cNvGraphicFramePr>
+              <a:graphicFrameLocks noChangeAspect="1"/>
+            </wp:cNvGraphicFramePr>
+            <a:graphic>
+              <a:graphicData uri="http://schemas.openxmlformats.org/drawingml/2006/picture">
+                <pic:pic>
+                  <pic:nvPicPr>
+                    <pic:cNvPr id="0" name="image.png"/>
+                    <pic:cNvPicPr/>
+                  </pic:nvPicPr>
+                  <pic:blipFill>
+                    <a:blip r:embed="rId24"/>
+                    <a:stretch>
+                      <a:fillRect/>
+                    </a:stretch>
+                  </pic:blipFill>
+                  <pic:spPr>
+                    <a:xfrm>
+                      <a:off x="0" y="0"/>
+                      <a:ext cx="5040000" cy="7478710"/>
+                    </a:xfrm>
+                    <a:prstGeom prst="rect"/>
+                  </pic:spPr>
+                </pic:pic>
+              </a:graphicData>
+            </a:graphic>
+          </wp:inline>
+        </w:drawing>
       </w:r>
     </w:p>
     <w:p>

</xml_diff>